<commit_message>
Switch color edition to white/black/yellow (3 colors) and add N badge
Part names are now white/black/yellow; the former coral parts (gnomon, N)
merge into yellow. The N sits on a black badge so it stays readable on the
white base. Word guide and image guides updated to match.

Co-Authored-By: Claude Sonnet 5.5 <noreply@anthropic.com>
Claude-Session: https://claude.ai/code/session_014TaHyWtXwxC7vjRjrVQQih
</commit_message>
<xml_diff>
--- a/3d-print/Planisphere_Gnomon_Color_Guide.docx
+++ b/3d-print/Planisphere_Gnomon_Color_Guide.docx
@@ -10,7 +10,7 @@
         <w:rPr>
           <w:b/>
           <w:bCs/>
-          <w:color w:val="12224A"/>
+          <w:color w:val="17181C"/>
           <w:sz w:val="56"/>
           <w:szCs w:val="56"/>
         </w:rPr>
@@ -20,13 +20,13 @@
     <w:p>
       <w:pPr>
         <w:pBdr>
-          <w:bottom w:val="single" w:color="F2B531" w:sz="16" w:space="6"/>
+          <w:bottom w:val="single" w:color="FFD21F" w:sz="16" w:space="6"/>
         </w:pBdr>
         <w:spacing w:after="120"/>
       </w:pPr>
       <w:r>
         <w:rPr>
-          <w:color w:val="EE5B3B"/>
+          <w:color w:val="9A6B00"/>
           <w:sz w:val="28"/>
           <w:szCs w:val="28"/>
         </w:rPr>
@@ -43,7 +43,7 @@
           <w:sz w:val="19"/>
           <w:szCs w:val="19"/>
         </w:rPr>
-        <w:t xml:space="preserve">Model file: planisphere_gnomon_color.scad   ·   4 colors   ·   one 250 × 250 mm print bed</w:t>
+        <w:t xml:space="preserve">Model file: planisphere_gnomon_color.scad   ·   3 colors   ·   one 250 × 250 mm print bed</w:t>
       </w:r>
     </w:p>
     <w:p>
@@ -51,7 +51,7 @@
         <w:pStyle w:val="Heading1"/>
         <w:keepNext/>
         <w:pBdr>
-          <w:bottom w:val="single" w:color="F2B531" w:sz="8" w:space="3"/>
+          <w:bottom w:val="single" w:color="FFD21F" w:sz="8" w:space="3"/>
         </w:pBdr>
         <w:spacing w:after="140" w:before="320"/>
       </w:pPr>
@@ -100,7 +100,7 @@
           <w:sz w:val="21"/>
           <w:szCs w:val="21"/>
         </w:rPr>
-        <w:t xml:space="preserve">. The color edition adds a four-color palette and lays every piece out on a </w:t>
+        <w:t xml:space="preserve">. The color edition adds a three-color palette (white, black and yellow) and lays every piece out on a </w:t>
       </w:r>
       <w:r>
         <w:rPr>
@@ -116,7 +116,7 @@
           <w:sz w:val="21"/>
           <w:szCs w:val="21"/>
         </w:rPr>
-        <w:t xml:space="preserve">, so one print job gives you the whole kit. You can print it as a multi-color job (a 4-slot AMS is a perfect fit) or in a single color.</w:t>
+        <w:t xml:space="preserve">, so one print job gives you the whole kit. You can print it as a multi-color job (three filaments, for example on an AMS) or in a single color.</w:t>
       </w:r>
     </w:p>
     <w:p>
@@ -130,7 +130,7 @@
           <wp:inline distT="0" distB="0" distL="0" distR="0">
             <wp:extent cx="4762500" cy="3333750"/>
             <wp:effectExtent t="0" r="0" b="0" l="0"/>
-            <wp:docPr id="1" name="Bed layout, perspective view" descr="All five parts laid out on one print bed: base with gold rim and compass ticks, navy star disc, coral gnomon, hinge pin and pivot pin." title="Bed layout, perspective view"/>
+            <wp:docPr id="1" name="Bed layout, perspective view" descr="All five parts laid out on one print bed: white base with yellow rim and black compass ticks, black star disc with yellow accents, yellow gnomon, white hinge pin and yellow pivot pin." title="Bed layout, perspective view"/>
             <wp:cNvGraphicFramePr>
               <a:graphicFrameLocks xmlns:a="http://schemas.openxmlformats.org/drawingml/2006/main" noChangeAspect="1"/>
             </wp:cNvGraphicFramePr>
@@ -187,7 +187,7 @@
         <w:pStyle w:val="Heading1"/>
         <w:keepNext/>
         <w:pBdr>
-          <w:bottom w:val="single" w:color="F2B531" w:sz="8" w:space="3"/>
+          <w:bottom w:val="single" w:color="FFD21F" w:sz="8" w:space="3"/>
         </w:pBdr>
         <w:spacing w:after="140" w:before="320"/>
       </w:pPr>
@@ -237,7 +237,7 @@
               <w:bottom w:val="single" w:color="C9C4B5" w:sz="4"/>
               <w:right w:val="single" w:color="C9C4B5" w:sz="4"/>
             </w:tcBorders>
-            <w:shd w:fill="12224A" w:color="auto" w:val="clear"/>
+            <w:shd w:fill="17181C" w:color="auto" w:val="clear"/>
             <w:tcMar>
               <w:top w:type="dxa" w:w="40"/>
               <w:left w:type="dxa" w:w="100"/>
@@ -271,7 +271,7 @@
               <w:bottom w:val="single" w:color="C9C4B5" w:sz="4"/>
               <w:right w:val="single" w:color="C9C4B5" w:sz="4"/>
             </w:tcBorders>
-            <w:shd w:fill="12224A" w:color="auto" w:val="clear"/>
+            <w:shd w:fill="17181C" w:color="auto" w:val="clear"/>
             <w:tcMar>
               <w:top w:type="dxa" w:w="40"/>
               <w:left w:type="dxa" w:w="100"/>
@@ -305,7 +305,7 @@
               <w:bottom w:val="single" w:color="C9C4B5" w:sz="4"/>
               <w:right w:val="single" w:color="C9C4B5" w:sz="4"/>
             </w:tcBorders>
-            <w:shd w:fill="12224A" w:color="auto" w:val="clear"/>
+            <w:shd w:fill="17181C" w:color="auto" w:val="clear"/>
             <w:tcMar>
               <w:top w:type="dxa" w:w="40"/>
               <w:left w:type="dxa" w:w="100"/>
@@ -339,7 +339,7 @@
               <w:bottom w:val="single" w:color="C9C4B5" w:sz="4"/>
               <w:right w:val="single" w:color="C9C4B5" w:sz="4"/>
             </w:tcBorders>
-            <w:shd w:fill="12224A" w:color="auto" w:val="clear"/>
+            <w:shd w:fill="17181C" w:color="auto" w:val="clear"/>
             <w:tcMar>
               <w:top w:type="dxa" w:w="40"/>
               <w:left w:type="dxa" w:w="100"/>
@@ -455,7 +455,7 @@
                 <w:sz w:val="19"/>
                 <w:szCs w:val="19"/>
               </w:rPr>
-              <w:t xml:space="preserve">Cream body · gold rim · navy degree ticks and S / E / W · coral N</w:t>
+              <w:t xml:space="preserve">White body · yellow rim · black degree ticks and S / E / W · yellow N on a black badge</w:t>
             </w:r>
           </w:p>
         </w:tc>
@@ -583,7 +583,7 @@
                 <w:sz w:val="19"/>
                 <w:szCs w:val="19"/>
               </w:rPr>
-              <w:t xml:space="preserve">Navy, with gold edge ring, gold star halos and gold pointer</w:t>
+              <w:t xml:space="preserve">Black, with yellow edge ring, yellow star halos and yellow pointer</w:t>
             </w:r>
           </w:p>
         </w:tc>
@@ -709,7 +709,7 @@
                 <w:sz w:val="19"/>
                 <w:szCs w:val="19"/>
               </w:rPr>
-              <w:t xml:space="preserve">Coral</w:t>
+              <w:t xml:space="preserve">Yellow</w:t>
             </w:r>
           </w:p>
         </w:tc>
@@ -837,7 +837,7 @@
                 <w:sz w:val="19"/>
                 <w:szCs w:val="19"/>
               </w:rPr>
-              <w:t xml:space="preserve">Cream</w:t>
+              <w:t xml:space="preserve">White</w:t>
             </w:r>
           </w:p>
         </w:tc>
@@ -963,7 +963,7 @@
                 <w:sz w:val="19"/>
                 <w:szCs w:val="19"/>
               </w:rPr>
-              <w:t xml:space="preserve">Gold</w:t>
+              <w:t xml:space="preserve">Yellow</w:t>
             </w:r>
           </w:p>
         </w:tc>
@@ -1011,7 +1011,7 @@
         <w:spacing w:after="80" w:before="200"/>
       </w:pPr>
       <w:r>
-        <w:t xml:space="preserve">The four colors</w:t>
+        <w:t xml:space="preserve">The three colors</w:t>
       </w:r>
     </w:p>
     <w:tbl>
@@ -1046,7 +1046,7 @@
               <w:bottom w:val="single" w:color="C9C4B5" w:sz="4"/>
               <w:right w:val="single" w:color="C9C4B5" w:sz="4"/>
             </w:tcBorders>
-            <w:shd w:fill="12224A" w:color="auto" w:val="clear"/>
+            <w:shd w:fill="17181C" w:color="auto" w:val="clear"/>
             <w:tcMar>
               <w:top w:type="dxa" w:w="40"/>
               <w:left w:type="dxa" w:w="100"/>
@@ -1070,7 +1070,7 @@
               <w:bottom w:val="single" w:color="C9C4B5" w:sz="4"/>
               <w:right w:val="single" w:color="C9C4B5" w:sz="4"/>
             </w:tcBorders>
-            <w:shd w:fill="12224A" w:color="auto" w:val="clear"/>
+            <w:shd w:fill="17181C" w:color="auto" w:val="clear"/>
             <w:tcMar>
               <w:top w:type="dxa" w:w="40"/>
               <w:left w:type="dxa" w:w="100"/>
@@ -1104,7 +1104,7 @@
               <w:bottom w:val="single" w:color="C9C4B5" w:sz="4"/>
               <w:right w:val="single" w:color="C9C4B5" w:sz="4"/>
             </w:tcBorders>
-            <w:shd w:fill="12224A" w:color="auto" w:val="clear"/>
+            <w:shd w:fill="17181C" w:color="auto" w:val="clear"/>
             <w:tcMar>
               <w:top w:type="dxa" w:w="40"/>
               <w:left w:type="dxa" w:w="100"/>
@@ -1138,7 +1138,7 @@
               <w:bottom w:val="single" w:color="C9C4B5" w:sz="4"/>
               <w:right w:val="single" w:color="C9C4B5" w:sz="4"/>
             </w:tcBorders>
-            <w:shd w:fill="12224A" w:color="auto" w:val="clear"/>
+            <w:shd w:fill="17181C" w:color="auto" w:val="clear"/>
             <w:tcMar>
               <w:top w:type="dxa" w:w="40"/>
               <w:left w:type="dxa" w:w="100"/>
@@ -1177,7 +1177,7 @@
               <w:bottom w:val="single" w:color="C9C4B5" w:sz="4"/>
               <w:right w:val="single" w:color="C9C4B5" w:sz="4"/>
             </w:tcBorders>
-            <w:shd w:fill="F3EAD3" w:color="auto" w:val="clear"/>
+            <w:shd w:fill="F6F6F1" w:color="auto" w:val="clear"/>
             <w:tcMar>
               <w:top w:type="dxa" w:w="40"/>
               <w:left w:type="dxa" w:w="100"/>
@@ -1218,7 +1218,7 @@
                 <w:sz w:val="19"/>
                 <w:szCs w:val="19"/>
               </w:rPr>
-              <w:t xml:space="preserve">Cream</w:t>
+              <w:t xml:space="preserve">White</w:t>
             </w:r>
           </w:p>
         </w:tc>
@@ -1248,7 +1248,7 @@
                 <w:sz w:val="19"/>
                 <w:szCs w:val="19"/>
               </w:rPr>
-              <w:t xml:space="preserve">#F3EAD3</w:t>
+              <w:t xml:space="preserve">#F6F6F1</w:t>
             </w:r>
           </w:p>
         </w:tc>
@@ -1296,7 +1296,7 @@
               <w:bottom w:val="single" w:color="C9C4B5" w:sz="4"/>
               <w:right w:val="single" w:color="C9C4B5" w:sz="4"/>
             </w:tcBorders>
-            <w:shd w:fill="12224A" w:color="auto" w:val="clear"/>
+            <w:shd w:fill="17181C" w:color="auto" w:val="clear"/>
             <w:tcMar>
               <w:top w:type="dxa" w:w="40"/>
               <w:left w:type="dxa" w:w="100"/>
@@ -1338,7 +1338,7 @@
                 <w:sz w:val="19"/>
                 <w:szCs w:val="19"/>
               </w:rPr>
-              <w:t xml:space="preserve">Navy</w:t>
+              <w:t xml:space="preserve">Black</w:t>
             </w:r>
           </w:p>
         </w:tc>
@@ -1369,7 +1369,7 @@
                 <w:sz w:val="19"/>
                 <w:szCs w:val="19"/>
               </w:rPr>
-              <w:t xml:space="preserve">#12224A</w:t>
+              <w:t xml:space="preserve">#17181C</w:t>
             </w:r>
           </w:p>
         </w:tc>
@@ -1400,7 +1400,7 @@
                 <w:sz w:val="19"/>
                 <w:szCs w:val="19"/>
               </w:rPr>
-              <w:t xml:space="preserve">Star disc, degree ticks, and the S / E / W letters.</w:t>
+              <w:t xml:space="preserve">Star disc, degree ticks, S / E / W letters and the badge behind the N.</w:t>
             </w:r>
           </w:p>
         </w:tc>
@@ -1418,7 +1418,7 @@
               <w:bottom w:val="single" w:color="C9C4B5" w:sz="4"/>
               <w:right w:val="single" w:color="C9C4B5" w:sz="4"/>
             </w:tcBorders>
-            <w:shd w:fill="F2B531" w:color="auto" w:val="clear"/>
+            <w:shd w:fill="FFD21F" w:color="auto" w:val="clear"/>
             <w:tcMar>
               <w:top w:type="dxa" w:w="40"/>
               <w:left w:type="dxa" w:w="100"/>
@@ -1459,7 +1459,7 @@
                 <w:sz w:val="19"/>
                 <w:szCs w:val="19"/>
               </w:rPr>
-              <w:t xml:space="preserve">Gold</w:t>
+              <w:t xml:space="preserve">Yellow</w:t>
             </w:r>
           </w:p>
         </w:tc>
@@ -1489,7 +1489,7 @@
                 <w:sz w:val="19"/>
                 <w:szCs w:val="19"/>
               </w:rPr>
-              <w:t xml:space="preserve">#F2B531</w:t>
+              <w:t xml:space="preserve">#FFD21F</w:t>
             </w:r>
           </w:p>
         </w:tc>
@@ -1519,129 +1519,7 @@
                 <w:sz w:val="19"/>
                 <w:szCs w:val="19"/>
               </w:rPr>
-              <w:t xml:space="preserve">Base rim, disc edge ring, star halos, pointer mark and pivot pin.</w:t>
-            </w:r>
-          </w:p>
-        </w:tc>
-      </w:tr>
-      <w:tr>
-        <w:trPr>
-          <w:cantSplit/>
-        </w:trPr>
-        <w:tc>
-          <w:tcPr>
-            <w:tcW w:type="dxa" w:w="700"/>
-            <w:tcBorders>
-              <w:top w:val="single" w:color="C9C4B5" w:sz="4"/>
-              <w:left w:val="single" w:color="C9C4B5" w:sz="4"/>
-              <w:bottom w:val="single" w:color="C9C4B5" w:sz="4"/>
-              <w:right w:val="single" w:color="C9C4B5" w:sz="4"/>
-            </w:tcBorders>
-            <w:shd w:fill="EE5B3B" w:color="auto" w:val="clear"/>
-            <w:tcMar>
-              <w:top w:type="dxa" w:w="40"/>
-              <w:left w:type="dxa" w:w="100"/>
-              <w:bottom w:type="dxa" w:w="40"/>
-              <w:right w:type="dxa" w:w="100"/>
-            </w:tcMar>
-          </w:tcPr>
-          <w:p>
-            <w:pPr>
-              <w:spacing w:after="40" w:before="40"/>
-              <w:jc w:val="left"/>
-            </w:pPr>
-          </w:p>
-        </w:tc>
-        <w:tc>
-          <w:tcPr>
-            <w:tcW w:type="dxa" w:w="1100"/>
-            <w:tcBorders>
-              <w:top w:val="single" w:color="C9C4B5" w:sz="4"/>
-              <w:left w:val="single" w:color="C9C4B5" w:sz="4"/>
-              <w:bottom w:val="single" w:color="C9C4B5" w:sz="4"/>
-              <w:right w:val="single" w:color="C9C4B5" w:sz="4"/>
-            </w:tcBorders>
-            <w:shd w:fill="FAF8F2" w:color="auto" w:val="clear"/>
-            <w:tcMar>
-              <w:top w:type="dxa" w:w="40"/>
-              <w:left w:type="dxa" w:w="100"/>
-              <w:bottom w:type="dxa" w:w="40"/>
-              <w:right w:type="dxa" w:w="100"/>
-            </w:tcMar>
-          </w:tcPr>
-          <w:p>
-            <w:pPr>
-              <w:spacing w:after="40" w:before="40"/>
-              <w:jc w:val="left"/>
-            </w:pPr>
-            <w:r>
-              <w:rPr>
-                <w:sz w:val="19"/>
-                <w:szCs w:val="19"/>
-              </w:rPr>
-              <w:t xml:space="preserve">Coral</w:t>
-            </w:r>
-          </w:p>
-        </w:tc>
-        <w:tc>
-          <w:tcPr>
-            <w:tcW w:type="dxa" w:w="1200"/>
-            <w:tcBorders>
-              <w:top w:val="single" w:color="C9C4B5" w:sz="4"/>
-              <w:left w:val="single" w:color="C9C4B5" w:sz="4"/>
-              <w:bottom w:val="single" w:color="C9C4B5" w:sz="4"/>
-              <w:right w:val="single" w:color="C9C4B5" w:sz="4"/>
-            </w:tcBorders>
-            <w:shd w:fill="FAF8F2" w:color="auto" w:val="clear"/>
-            <w:tcMar>
-              <w:top w:type="dxa" w:w="40"/>
-              <w:left w:type="dxa" w:w="100"/>
-              <w:bottom w:type="dxa" w:w="40"/>
-              <w:right w:type="dxa" w:w="100"/>
-            </w:tcMar>
-          </w:tcPr>
-          <w:p>
-            <w:pPr>
-              <w:spacing w:after="40" w:before="40"/>
-              <w:jc w:val="left"/>
-            </w:pPr>
-            <w:r>
-              <w:rPr>
-                <w:sz w:val="19"/>
-                <w:szCs w:val="19"/>
-              </w:rPr>
-              <w:t xml:space="preserve">#EE5B3B</w:t>
-            </w:r>
-          </w:p>
-        </w:tc>
-        <w:tc>
-          <w:tcPr>
-            <w:tcW w:type="dxa" w:w="6026"/>
-            <w:tcBorders>
-              <w:top w:val="single" w:color="C9C4B5" w:sz="4"/>
-              <w:left w:val="single" w:color="C9C4B5" w:sz="4"/>
-              <w:bottom w:val="single" w:color="C9C4B5" w:sz="4"/>
-              <w:right w:val="single" w:color="C9C4B5" w:sz="4"/>
-            </w:tcBorders>
-            <w:shd w:fill="FAF8F2" w:color="auto" w:val="clear"/>
-            <w:tcMar>
-              <w:top w:type="dxa" w:w="40"/>
-              <w:left w:type="dxa" w:w="100"/>
-              <w:bottom w:type="dxa" w:w="40"/>
-              <w:right w:type="dxa" w:w="100"/>
-            </w:tcMar>
-          </w:tcPr>
-          <w:p>
-            <w:pPr>
-              <w:spacing w:after="40" w:before="40"/>
-              <w:jc w:val="left"/>
-            </w:pPr>
-            <w:r>
-              <w:rPr>
-                <w:sz w:val="19"/>
-                <w:szCs w:val="19"/>
-              </w:rPr>
-              <w:t xml:space="preserve">North letter (N) and the gnomon.</w:t>
+              <w:t xml:space="preserve">Base rim, disc edge ring, star halos, pointer mark, pivot pin, gnomon and the N letter.</w:t>
             </w:r>
           </w:p>
         </w:tc>
@@ -1650,7 +1528,7 @@
     <w:p>
       <w:pPr>
         <w:pBdr>
-          <w:left w:val="single" w:color="F2B531" w:sz="18" w:space="6"/>
+          <w:left w:val="single" w:color="FFD21F" w:sz="18" w:space="6"/>
         </w:pBdr>
         <w:shd w:fill="FFF6DD" w:color="auto" w:val="clear"/>
         <w:spacing w:after="140" w:before="80" w:line="270"/>
@@ -1671,7 +1549,7 @@
           <w:sz w:val="20"/>
           <w:szCs w:val="20"/>
         </w:rPr>
-        <w:t xml:space="preserve">The hex values are only suggestions. Any four filaments work as long as </w:t>
+        <w:t xml:space="preserve">The hex values are only suggestions. Any three filaments work as long as </w:t>
       </w:r>
       <w:r>
         <w:rPr>
@@ -1680,7 +1558,7 @@
           <w:sz w:val="20"/>
           <w:szCs w:val="20"/>
         </w:rPr>
-        <w:t xml:space="preserve">cream and navy contrast strongly</w:t>
+        <w:t xml:space="preserve">white and black contrast strongly</w:t>
       </w:r>
       <w:r>
         <w:rPr>
@@ -1695,7 +1573,7 @@
         <w:pStyle w:val="Heading1"/>
         <w:keepNext/>
         <w:pBdr>
-          <w:bottom w:val="single" w:color="F2B531" w:sz="8" w:space="3"/>
+          <w:bottom w:val="single" w:color="FFD21F" w:sz="8" w:space="3"/>
         </w:pBdr>
         <w:spacing w:after="140" w:before="320"/>
       </w:pPr>
@@ -1712,7 +1590,7 @@
           <w:sz w:val="21"/>
           <w:szCs w:val="21"/>
         </w:rPr>
-        <w:t xml:space="preserve">All pieces are positioned relative to the center of the base (the origin). Do not move them: the four color files share the same coordinates so they line up when imported together.</w:t>
+        <w:t xml:space="preserve">All pieces are positioned relative to the center of the base (the origin). Do not move them: the three color files share the same coordinates so they line up when imported together.</w:t>
       </w:r>
     </w:p>
     <w:tbl>
@@ -1746,7 +1624,7 @@
               <w:bottom w:val="single" w:color="C9C4B5" w:sz="4"/>
               <w:right w:val="single" w:color="C9C4B5" w:sz="4"/>
             </w:tcBorders>
-            <w:shd w:fill="12224A" w:color="auto" w:val="clear"/>
+            <w:shd w:fill="17181C" w:color="auto" w:val="clear"/>
             <w:tcMar>
               <w:top w:type="dxa" w:w="40"/>
               <w:left w:type="dxa" w:w="100"/>
@@ -1780,7 +1658,7 @@
               <w:bottom w:val="single" w:color="C9C4B5" w:sz="4"/>
               <w:right w:val="single" w:color="C9C4B5" w:sz="4"/>
             </w:tcBorders>
-            <w:shd w:fill="12224A" w:color="auto" w:val="clear"/>
+            <w:shd w:fill="17181C" w:color="auto" w:val="clear"/>
             <w:tcMar>
               <w:top w:type="dxa" w:w="40"/>
               <w:left w:type="dxa" w:w="100"/>
@@ -1814,7 +1692,7 @@
               <w:bottom w:val="single" w:color="C9C4B5" w:sz="4"/>
               <w:right w:val="single" w:color="C9C4B5" w:sz="4"/>
             </w:tcBorders>
-            <w:shd w:fill="12224A" w:color="auto" w:val="clear"/>
+            <w:shd w:fill="17181C" w:color="auto" w:val="clear"/>
             <w:tcMar>
               <w:top w:type="dxa" w:w="40"/>
               <w:left w:type="dxa" w:w="100"/>
@@ -2373,9 +2251,9 @@
       <w:r>
         <w:drawing>
           <wp:inline distT="0" distB="0" distL="0" distR="0">
-            <wp:extent cx="4476750" cy="3248025"/>
+            <wp:extent cx="4476750" cy="3019425"/>
             <wp:effectExtent t="0" r="0" b="0" l="0"/>
-            <wp:docPr id="1" name="Bed layout, top view" descr="Top view of the layout: base at left, star disc at right, gnomon, hinge pin and pivot pin along the bottom." title="Bed layout, top view"/>
+            <wp:docPr id="1" name="Bed layout, top view" descr="Slightly tilted top view of the layout: base at left, star disc at right, gnomon, hinge pin and pivot pin along the bottom." title="Bed layout, top view"/>
             <wp:cNvGraphicFramePr>
               <a:graphicFrameLocks xmlns:a="http://schemas.openxmlformats.org/drawingml/2006/main" noChangeAspect="1"/>
             </wp:cNvGraphicFramePr>
@@ -2398,7 +2276,7 @@
                   <pic:spPr bwMode="auto">
                     <a:xfrm>
                       <a:off x="0" y="0"/>
-                      <a:ext cx="4476750" cy="3248025"/>
+                      <a:ext cx="4476750" cy="3019425"/>
                     </a:xfrm>
                     <a:prstGeom prst="rect">
                       <a:avLst/>
@@ -2424,7 +2302,7 @@
           <w:sz w:val="18"/>
           <w:szCs w:val="18"/>
         </w:rPr>
-        <w:t xml:space="preserve">Figure 2 – Top view of the layout.</w:t>
+        <w:t xml:space="preserve">Figure 2 – Layout view (slightly tilted top view).</w:t>
       </w:r>
     </w:p>
     <w:p>
@@ -2432,7 +2310,7 @@
         <w:pStyle w:val="Heading1"/>
         <w:keepNext/>
         <w:pBdr>
-          <w:bottom w:val="single" w:color="F2B531" w:sz="8" w:space="3"/>
+          <w:bottom w:val="single" w:color="FFD21F" w:sz="8" w:space="3"/>
         </w:pBdr>
         <w:spacing w:after="140" w:before="320"/>
       </w:pPr>
@@ -2454,7 +2332,7 @@
       <w:r>
         <w:rPr>
           <w:rFonts w:ascii="Consolas" w:cs="Consolas" w:eastAsia="Consolas" w:hAnsi="Consolas"/>
-          <w:color w:val="12224A"/>
+          <w:color w:val="17181C"/>
           <w:sz w:val="21"/>
           <w:szCs w:val="21"/>
         </w:rPr>
@@ -2497,7 +2375,7 @@
       <w:r>
         <w:rPr>
           <w:rFonts w:ascii="Consolas" w:cs="Consolas" w:eastAsia="Consolas" w:hAnsi="Consolas"/>
-          <w:color w:val="12224A"/>
+          <w:color w:val="17181C"/>
           <w:sz w:val="21"/>
           <w:szCs w:val="21"/>
         </w:rPr>
@@ -2546,7 +2424,7 @@
       <w:r>
         <w:rPr>
           <w:rFonts w:ascii="Consolas" w:cs="Consolas" w:eastAsia="Consolas" w:hAnsi="Consolas"/>
-          <w:color w:val="12224A"/>
+          <w:color w:val="17181C"/>
           <w:sz w:val="21"/>
           <w:szCs w:val="21"/>
         </w:rPr>
@@ -2562,11 +2440,11 @@
       <w:r>
         <w:rPr>
           <w:rFonts w:ascii="Consolas" w:cs="Consolas" w:eastAsia="Consolas" w:hAnsi="Consolas"/>
-          <w:color w:val="12224A"/>
-          <w:sz w:val="21"/>
-          <w:szCs w:val="21"/>
-        </w:rPr>
-        <w:t xml:space="preserve">part = "cream";</w:t>
+          <w:color w:val="17181C"/>
+          <w:sz w:val="21"/>
+          <w:szCs w:val="21"/>
+        </w:rPr>
+        <w:t xml:space="preserve">part = "white";</w:t>
       </w:r>
       <w:r>
         <w:rPr>
@@ -2627,11 +2505,11 @@
       <w:r>
         <w:rPr>
           <w:rFonts w:ascii="Consolas" w:cs="Consolas" w:eastAsia="Consolas" w:hAnsi="Consolas"/>
-          <w:color w:val="12224A"/>
-          <w:sz w:val="21"/>
-          <w:szCs w:val="21"/>
-        </w:rPr>
-        <w:t xml:space="preserve">cream.stl</w:t>
+          <w:color w:val="17181C"/>
+          <w:sz w:val="21"/>
+          <w:szCs w:val="21"/>
+        </w:rPr>
+        <w:t xml:space="preserve">white.stl</w:t>
       </w:r>
       <w:r>
         <w:rPr>
@@ -2660,50 +2538,34 @@
       <w:r>
         <w:rPr>
           <w:rFonts w:ascii="Consolas" w:cs="Consolas" w:eastAsia="Consolas" w:hAnsi="Consolas"/>
-          <w:color w:val="12224A"/>
-          <w:sz w:val="21"/>
-          <w:szCs w:val="21"/>
-        </w:rPr>
-        <w:t xml:space="preserve">"navy"</w:t>
-      </w:r>
-      <w:r>
-        <w:rPr>
-          <w:sz w:val="21"/>
-          <w:szCs w:val="21"/>
-        </w:rPr>
-        <w:t xml:space="preserve">, </w:t>
+          <w:color w:val="17181C"/>
+          <w:sz w:val="21"/>
+          <w:szCs w:val="21"/>
+        </w:rPr>
+        <w:t xml:space="preserve">"black"</w:t>
+      </w:r>
+      <w:r>
+        <w:rPr>
+          <w:sz w:val="21"/>
+          <w:szCs w:val="21"/>
+        </w:rPr>
+        <w:t xml:space="preserve"> and </w:t>
       </w:r>
       <w:r>
         <w:rPr>
           <w:rFonts w:ascii="Consolas" w:cs="Consolas" w:eastAsia="Consolas" w:hAnsi="Consolas"/>
-          <w:color w:val="12224A"/>
-          <w:sz w:val="21"/>
-          <w:szCs w:val="21"/>
-        </w:rPr>
-        <w:t xml:space="preserve">"gold"</w:t>
-      </w:r>
-      <w:r>
-        <w:rPr>
-          <w:sz w:val="21"/>
-          <w:szCs w:val="21"/>
-        </w:rPr>
-        <w:t xml:space="preserve"> and </w:t>
-      </w:r>
-      <w:r>
-        <w:rPr>
-          <w:rFonts w:ascii="Consolas" w:cs="Consolas" w:eastAsia="Consolas" w:hAnsi="Consolas"/>
-          <w:color w:val="12224A"/>
-          <w:sz w:val="21"/>
-          <w:szCs w:val="21"/>
-        </w:rPr>
-        <w:t xml:space="preserve">"coral"</w:t>
-      </w:r>
-      <w:r>
-        <w:rPr>
-          <w:sz w:val="21"/>
-          <w:szCs w:val="21"/>
-        </w:rPr>
-        <w:t xml:space="preserve">. You end up with four STL files.</w:t>
+          <w:color w:val="17181C"/>
+          <w:sz w:val="21"/>
+          <w:szCs w:val="21"/>
+        </w:rPr>
+        <w:t xml:space="preserve">"yellow"</w:t>
+      </w:r>
+      <w:r>
+        <w:rPr>
+          <w:sz w:val="21"/>
+          <w:szCs w:val="21"/>
+        </w:rPr>
+        <w:t xml:space="preserve">. You end up with three STL files.</w:t>
       </w:r>
     </w:p>
     <w:p>
@@ -2719,7 +2581,7 @@
     <w:p>
       <w:pPr>
         <w:pBdr>
-          <w:left w:val="single" w:color="12224A" w:sz="18" w:space="6"/>
+          <w:left w:val="single" w:color="17181C" w:sz="18" w:space="6"/>
         </w:pBdr>
         <w:shd w:fill="EEF0F4" w:color="auto" w:val="clear"/>
         <w:spacing w:after="0" w:before="0" w:line="252"/>
@@ -2728,17 +2590,17 @@
       <w:r>
         <w:rPr>
           <w:rFonts w:ascii="Consolas" w:cs="Consolas" w:eastAsia="Consolas" w:hAnsi="Consolas"/>
-          <w:color w:val="12224A"/>
+          <w:color w:val="17181C"/>
           <w:sz w:val="18"/>
           <w:szCs w:val="18"/>
         </w:rPr>
-        <w:t xml:space="preserve">for c in cream navy gold coral; do</w:t>
+        <w:t xml:space="preserve">for c in white black yellow; do</w:t>
       </w:r>
     </w:p>
     <w:p>
       <w:pPr>
         <w:pBdr>
-          <w:left w:val="single" w:color="12224A" w:sz="18" w:space="6"/>
+          <w:left w:val="single" w:color="17181C" w:sz="18" w:space="6"/>
         </w:pBdr>
         <w:shd w:fill="EEF0F4" w:color="auto" w:val="clear"/>
         <w:spacing w:after="0" w:before="0" w:line="252"/>
@@ -2747,7 +2609,7 @@
       <w:r>
         <w:rPr>
           <w:rFonts w:ascii="Consolas" w:cs="Consolas" w:eastAsia="Consolas" w:hAnsi="Consolas"/>
-          <w:color w:val="12224A"/>
+          <w:color w:val="17181C"/>
           <w:sz w:val="18"/>
           <w:szCs w:val="18"/>
         </w:rPr>
@@ -2757,7 +2619,7 @@
     <w:p>
       <w:pPr>
         <w:pBdr>
-          <w:left w:val="single" w:color="12224A" w:sz="18" w:space="6"/>
+          <w:left w:val="single" w:color="17181C" w:sz="18" w:space="6"/>
         </w:pBdr>
         <w:shd w:fill="EEF0F4" w:color="auto" w:val="clear"/>
         <w:spacing w:after="140" w:before="0" w:line="252"/>
@@ -2766,7 +2628,7 @@
       <w:r>
         <w:rPr>
           <w:rFonts w:ascii="Consolas" w:cs="Consolas" w:eastAsia="Consolas" w:hAnsi="Consolas"/>
-          <w:color w:val="12224A"/>
+          <w:color w:val="17181C"/>
           <w:sz w:val="18"/>
           <w:szCs w:val="18"/>
         </w:rPr>
@@ -2788,7 +2650,7 @@
     <w:p>
       <w:pPr>
         <w:pBdr>
-          <w:left w:val="single" w:color="12224A" w:sz="18" w:space="6"/>
+          <w:left w:val="single" w:color="17181C" w:sz="18" w:space="6"/>
         </w:pBdr>
         <w:shd w:fill="EEF0F4" w:color="auto" w:val="clear"/>
         <w:spacing w:after="140" w:before="0" w:line="252"/>
@@ -2797,17 +2659,17 @@
       <w:r>
         <w:rPr>
           <w:rFonts w:ascii="Consolas" w:cs="Consolas" w:eastAsia="Consolas" w:hAnsi="Consolas"/>
-          <w:color w:val="12224A"/>
+          <w:color w:val="17181C"/>
           <w:sz w:val="18"/>
           <w:szCs w:val="18"/>
         </w:rPr>
-        <w:t xml:space="preserve">openscad -o cream.stl -D "part=\"cream\"" planisphere_gnomon_color.scad</w:t>
+        <w:t xml:space="preserve">openscad -o white.stl -D "part=\"white\"" planisphere_gnomon_color.scad</w:t>
       </w:r>
     </w:p>
     <w:p>
       <w:pPr>
         <w:pBdr>
-          <w:left w:val="single" w:color="F2B531" w:sz="18" w:space="6"/>
+          <w:left w:val="single" w:color="FFD21F" w:sz="18" w:space="6"/>
         </w:pBdr>
         <w:shd w:fill="FFF6DD" w:color="auto" w:val="clear"/>
         <w:spacing w:after="140" w:before="80" w:line="270"/>
@@ -2833,7 +2695,7 @@
       <w:r>
         <w:rPr>
           <w:rFonts w:ascii="Consolas" w:cs="Consolas" w:eastAsia="Consolas" w:hAnsi="Consolas"/>
-          <w:color w:val="12224A"/>
+          <w:color w:val="17181C"/>
           <w:sz w:val="20"/>
           <w:szCs w:val="20"/>
         </w:rPr>
@@ -2852,7 +2714,7 @@
         <w:pStyle w:val="Heading1"/>
         <w:keepNext/>
         <w:pBdr>
-          <w:bottom w:val="single" w:color="F2B531" w:sz="8" w:space="3"/>
+          <w:bottom w:val="single" w:color="FFD21F" w:sz="8" w:space="3"/>
         </w:pBdr>
         <w:spacing w:after="140" w:before="320"/>
       </w:pPr>
@@ -2874,7 +2736,7 @@
           <w:sz w:val="21"/>
           <w:szCs w:val="21"/>
         </w:rPr>
-        <w:t xml:space="preserve">Import all four STL files </w:t>
+        <w:t xml:space="preserve">Import all three STL files </w:t>
       </w:r>
       <w:r>
         <w:rPr>
@@ -2923,7 +2785,7 @@
           <w:sz w:val="21"/>
           <w:szCs w:val="21"/>
         </w:rPr>
-        <w:t xml:space="preserve">Assign one filament to each part: cream, navy, gold and coral.</w:t>
+        <w:t xml:space="preserve">Assign one filament to each part: white, black and yellow.</w:t>
       </w:r>
     </w:p>
     <w:p>
@@ -2979,7 +2841,7 @@
               <w:bottom w:val="single" w:color="C9C4B5" w:sz="4"/>
               <w:right w:val="single" w:color="C9C4B5" w:sz="4"/>
             </w:tcBorders>
-            <w:shd w:fill="12224A" w:color="auto" w:val="clear"/>
+            <w:shd w:fill="17181C" w:color="auto" w:val="clear"/>
             <w:tcMar>
               <w:top w:type="dxa" w:w="40"/>
               <w:left w:type="dxa" w:w="100"/>
@@ -3013,7 +2875,7 @@
               <w:bottom w:val="single" w:color="C9C4B5" w:sz="4"/>
               <w:right w:val="single" w:color="C9C4B5" w:sz="4"/>
             </w:tcBorders>
-            <w:shd w:fill="12224A" w:color="auto" w:val="clear"/>
+            <w:shd w:fill="17181C" w:color="auto" w:val="clear"/>
             <w:tcMar>
               <w:top w:type="dxa" w:w="40"/>
               <w:left w:type="dxa" w:w="100"/>
@@ -3047,7 +2909,7 @@
               <w:bottom w:val="single" w:color="C9C4B5" w:sz="4"/>
               <w:right w:val="single" w:color="C9C4B5" w:sz="4"/>
             </w:tcBorders>
-            <w:shd w:fill="12224A" w:color="auto" w:val="clear"/>
+            <w:shd w:fill="17181C" w:color="auto" w:val="clear"/>
             <w:tcMar>
               <w:top w:type="dxa" w:w="40"/>
               <w:left w:type="dxa" w:w="100"/>
@@ -3163,7 +3025,7 @@
                 <w:sz w:val="19"/>
                 <w:szCs w:val="19"/>
               </w:rPr>
-              <w:t xml:space="preserve">Every raised or inlaid detail is a multiple of 0.2 mm: ticks 1.0 mm deep, letters 0.6 mm, gold accents 0.4 mm, pointer 0.8 mm.</w:t>
+              <w:t xml:space="preserve">Every raised or inlaid detail is a multiple of 0.2 mm: ticks 1.0 mm deep, letters 0.6 mm, yellow accents 0.4 mm, pointer 0.8 mm, N badge 0.6 mm.</w:t>
             </w:r>
           </w:p>
         </w:tc>
@@ -3722,7 +3584,7 @@
       <w:r>
         <w:rPr>
           <w:rFonts w:ascii="Consolas" w:cs="Consolas" w:eastAsia="Consolas" w:hAnsi="Consolas"/>
-          <w:color w:val="12224A"/>
+          <w:color w:val="17181C"/>
           <w:sz w:val="21"/>
           <w:szCs w:val="21"/>
         </w:rPr>
@@ -3738,7 +3600,7 @@
       <w:r>
         <w:rPr>
           <w:rFonts w:ascii="Consolas" w:cs="Consolas" w:eastAsia="Consolas" w:hAnsi="Consolas"/>
-          <w:color w:val="12224A"/>
+          <w:color w:val="17181C"/>
           <w:sz w:val="21"/>
           <w:szCs w:val="21"/>
         </w:rPr>
@@ -3749,7 +3611,7 @@
           <w:sz w:val="21"/>
           <w:szCs w:val="21"/>
         </w:rPr>
-        <w:t xml:space="preserve"> and export one STL. Letters, rim, halos and pointer remain visible as raised relief.</w:t>
+        <w:t xml:space="preserve"> and export one STL. Letters, rim, halos and pointer remain visible as raised relief (the N badge is a raised disc).</w:t>
       </w:r>
     </w:p>
     <w:p>
@@ -3783,7 +3645,7 @@
         <w:pStyle w:val="Heading1"/>
         <w:keepNext/>
         <w:pBdr>
-          <w:bottom w:val="single" w:color="F2B531" w:sz="8" w:space="3"/>
+          <w:bottom w:val="single" w:color="FFD21F" w:sz="8" w:space="3"/>
         </w:pBdr>
         <w:spacing w:after="140" w:before="320"/>
       </w:pPr>
@@ -3840,7 +3702,7 @@
           <w:sz w:val="21"/>
           <w:szCs w:val="21"/>
         </w:rPr>
-        <w:t xml:space="preserve"> Push the pivot pin up through the base from underneath (head on the underside), then lay the star disc on the base with the gold ring facing up. The pin tip ends about 0.2 mm above the disc.</w:t>
+        <w:t xml:space="preserve"> Push the pivot pin up through the base from underneath (head on the underside), then lay the star disc on the base with the yellow ring facing up. The pin tip ends about 0.2 mm above the disc.</w:t>
       </w:r>
     </w:p>
     <w:p>
@@ -3926,7 +3788,7 @@
         <w:pStyle w:val="Heading1"/>
         <w:keepNext/>
         <w:pBdr>
-          <w:bottom w:val="single" w:color="F2B531" w:sz="8" w:space="3"/>
+          <w:bottom w:val="single" w:color="FFD21F" w:sz="8" w:space="3"/>
         </w:pBdr>
         <w:spacing w:after="140" w:before="320"/>
       </w:pPr>
@@ -3957,7 +3819,7 @@
           <w:sz w:val="21"/>
           <w:szCs w:val="21"/>
         </w:rPr>
-        <w:t xml:space="preserve"> Lay the base flat and turn it until the coral </w:t>
+        <w:t xml:space="preserve"> Lay the base flat and turn it until the </w:t>
       </w:r>
       <w:r>
         <w:rPr>
@@ -3973,7 +3835,7 @@
           <w:sz w:val="21"/>
           <w:szCs w:val="21"/>
         </w:rPr>
-        <w:t xml:space="preserve"> points to true north (a phone compass or a known landmark works).</w:t>
+        <w:t xml:space="preserve"> badge points to true north (a phone compass or a known landmark works).</w:t>
       </w:r>
     </w:p>
     <w:p>
@@ -3999,7 +3861,7 @@
           <w:sz w:val="21"/>
           <w:szCs w:val="21"/>
         </w:rPr>
-        <w:t xml:space="preserve"> by the 12 grip notches around its edge. The gold pointer on the disc reads against the 5° tick ring on the base; the letters N, E, S, W mark the cardinal directions.</w:t>
+        <w:t xml:space="preserve"> by the 12 grip notches around its edge. The yellow pointer on the disc reads against the 5° tick ring on the base; the letters N, E, S, W mark the cardinal directions.</w:t>
       </w:r>
     </w:p>
     <w:p>
@@ -4082,7 +3944,7 @@
       <w:r>
         <w:rPr>
           <w:rFonts w:ascii="Consolas" w:cs="Consolas" w:eastAsia="Consolas" w:hAnsi="Consolas"/>
-          <w:color w:val="12224A"/>
+          <w:color w:val="17181C"/>
           <w:sz w:val="21"/>
           <w:szCs w:val="21"/>
         </w:rPr>
@@ -4098,7 +3960,7 @@
       <w:r>
         <w:rPr>
           <w:rFonts w:ascii="Consolas" w:cs="Consolas" w:eastAsia="Consolas" w:hAnsi="Consolas"/>
-          <w:color w:val="12224A"/>
+          <w:color w:val="17181C"/>
           <w:sz w:val="21"/>
           <w:szCs w:val="21"/>
         </w:rPr>
@@ -4109,13 +3971,13 @@
           <w:sz w:val="21"/>
           <w:szCs w:val="21"/>
         </w:rPr>
-        <w:t xml:space="preserve"> (30° → 24.8 mm, 45° → 43.0 mm), then re-export the coral part.</w:t>
+        <w:t xml:space="preserve"> (30° → 24.8 mm, 45° → 43.0 mm), then re-export the yellow part.</w:t>
       </w:r>
     </w:p>
     <w:p>
       <w:pPr>
         <w:pBdr>
-          <w:left w:val="single" w:color="F2B531" w:sz="18" w:space="6"/>
+          <w:left w:val="single" w:color="FFD21F" w:sz="18" w:space="6"/>
         </w:pBdr>
         <w:shd w:fill="FFF6DD" w:color="auto" w:val="clear"/>
         <w:spacing w:after="140" w:before="80" w:line="270"/>
@@ -4144,7 +4006,7 @@
         <w:pStyle w:val="Heading1"/>
         <w:keepNext/>
         <w:pBdr>
-          <w:bottom w:val="single" w:color="F2B531" w:sz="8" w:space="3"/>
+          <w:bottom w:val="single" w:color="FFD21F" w:sz="8" w:space="3"/>
         </w:pBdr>
         <w:spacing w:after="140" w:before="320"/>
       </w:pPr>
@@ -4166,7 +4028,7 @@
       <w:r>
         <w:rPr>
           <w:rFonts w:ascii="Consolas" w:cs="Consolas" w:eastAsia="Consolas" w:hAnsi="Consolas"/>
-          <w:color w:val="12224A"/>
+          <w:color w:val="17181C"/>
           <w:sz w:val="21"/>
           <w:szCs w:val="21"/>
         </w:rPr>
@@ -4211,7 +4073,7 @@
               <w:bottom w:val="single" w:color="C9C4B5" w:sz="4"/>
               <w:right w:val="single" w:color="C9C4B5" w:sz="4"/>
             </w:tcBorders>
-            <w:shd w:fill="12224A" w:color="auto" w:val="clear"/>
+            <w:shd w:fill="17181C" w:color="auto" w:val="clear"/>
             <w:tcMar>
               <w:top w:type="dxa" w:w="40"/>
               <w:left w:type="dxa" w:w="100"/>
@@ -4245,7 +4107,7 @@
               <w:bottom w:val="single" w:color="C9C4B5" w:sz="4"/>
               <w:right w:val="single" w:color="C9C4B5" w:sz="4"/>
             </w:tcBorders>
-            <w:shd w:fill="12224A" w:color="auto" w:val="clear"/>
+            <w:shd w:fill="17181C" w:color="auto" w:val="clear"/>
             <w:tcMar>
               <w:top w:type="dxa" w:w="40"/>
               <w:left w:type="dxa" w:w="100"/>
@@ -4279,7 +4141,7 @@
               <w:bottom w:val="single" w:color="C9C4B5" w:sz="4"/>
               <w:right w:val="single" w:color="C9C4B5" w:sz="4"/>
             </w:tcBorders>
-            <w:shd w:fill="12224A" w:color="auto" w:val="clear"/>
+            <w:shd w:fill="17181C" w:color="auto" w:val="clear"/>
             <w:tcMar>
               <w:top w:type="dxa" w:w="40"/>
               <w:left w:type="dxa" w:w="100"/>
@@ -4396,7 +4258,7 @@
                 <w:sz w:val="19"/>
                 <w:szCs w:val="19"/>
               </w:rPr>
-              <w:t xml:space="preserve">"all" shows every color for preview. "cream", "navy", "gold" or "coral" outputs only that color, for STL export.</w:t>
+              <w:t xml:space="preserve">"all" shows every color for preview. "white", "black" or "yellow" outputs only that color, for STL export.</w:t>
             </w:r>
           </w:p>
         </w:tc>
@@ -4495,7 +4357,7 @@
                 <w:sz w:val="19"/>
                 <w:szCs w:val="19"/>
               </w:rPr>
-              <w:t xml:space="preserve">Fills the degree ticks with navy. Set to false to leave them as grooves (single-color prints).</w:t>
+              <w:t xml:space="preserve">Fills the degree ticks with black. Set to false to leave them as grooves (single-color prints).</w:t>
             </w:r>
           </w:p>
         </w:tc>
@@ -4591,7 +4453,7 @@
                 <w:sz w:val="19"/>
                 <w:szCs w:val="19"/>
               </w:rPr>
-              <w:t xml:space="preserve">Gold ring around each star hole on the disc.</w:t>
+              <w:t xml:space="preserve">Yellow ring around each star hole on the disc.</w:t>
             </w:r>
           </w:p>
         </w:tc>
@@ -4628,7 +4490,7 @@
                 <w:sz w:val="19"/>
                 <w:szCs w:val="19"/>
               </w:rPr>
-              <w:t xml:space="preserve">show_bed</w:t>
+              <w:t xml:space="preserve">north_badge</w:t>
             </w:r>
           </w:p>
         </w:tc>
@@ -4690,7 +4552,7 @@
                 <w:sz w:val="19"/>
                 <w:szCs w:val="19"/>
               </w:rPr>
-              <w:t xml:space="preserve">Draws the 250 × 250 mm bed outline in the preview only. It is never exported.</w:t>
+              <w:t xml:space="preserve">Black round badge behind the yellow N so it stays readable on the white base.</w:t>
             </w:r>
           </w:p>
         </w:tc>
@@ -4726,52 +4588,7 @@
                 <w:sz w:val="19"/>
                 <w:szCs w:val="19"/>
               </w:rPr>
-              <w:t xml:space="preserve">c_cream</w:t>
-            </w:r>
-            <w:r>
-              <w:rPr>
-                <w:sz w:val="19"/>
-                <w:szCs w:val="19"/>
-              </w:rPr>
-              <w:t xml:space="preserve">, </w:t>
-            </w:r>
-            <w:r>
-              <w:rPr>
-                <w:rFonts w:ascii="Consolas" w:cs="Consolas" w:eastAsia="Consolas" w:hAnsi="Consolas"/>
-                <w:sz w:val="19"/>
-                <w:szCs w:val="19"/>
-              </w:rPr>
-              <w:t xml:space="preserve">c_navy</w:t>
-            </w:r>
-            <w:r>
-              <w:rPr>
-                <w:sz w:val="19"/>
-                <w:szCs w:val="19"/>
-              </w:rPr>
-              <w:t xml:space="preserve">, </w:t>
-            </w:r>
-            <w:r>
-              <w:rPr>
-                <w:rFonts w:ascii="Consolas" w:cs="Consolas" w:eastAsia="Consolas" w:hAnsi="Consolas"/>
-                <w:sz w:val="19"/>
-                <w:szCs w:val="19"/>
-              </w:rPr>
-              <w:t xml:space="preserve">c_gold</w:t>
-            </w:r>
-            <w:r>
-              <w:rPr>
-                <w:sz w:val="19"/>
-                <w:szCs w:val="19"/>
-              </w:rPr>
-              <w:t xml:space="preserve">, </w:t>
-            </w:r>
-            <w:r>
-              <w:rPr>
-                <w:rFonts w:ascii="Consolas" w:cs="Consolas" w:eastAsia="Consolas" w:hAnsi="Consolas"/>
-                <w:sz w:val="19"/>
-                <w:szCs w:val="19"/>
-              </w:rPr>
-              <w:t xml:space="preserve">c_coral</w:t>
+              <w:t xml:space="preserve">show_bed</w:t>
             </w:r>
           </w:p>
         </w:tc>
@@ -4801,7 +4618,7 @@
                 <w:sz w:val="19"/>
                 <w:szCs w:val="19"/>
               </w:rPr>
-              <w:t xml:space="preserve">see Section 2</w:t>
+              <w:t xml:space="preserve">true</w:t>
             </w:r>
           </w:p>
         </w:tc>
@@ -4831,7 +4648,7 @@
                 <w:sz w:val="19"/>
                 <w:szCs w:val="19"/>
               </w:rPr>
-              <w:t xml:space="preserve">Preview colors. Change them to try other palettes.</w:t>
+              <w:t xml:space="preserve">Draws the 250 × 250 mm bed outline in the preview only. It is never exported.</w:t>
             </w:r>
           </w:p>
         </w:tc>
@@ -4868,7 +4685,37 @@
                 <w:sz w:val="19"/>
                 <w:szCs w:val="19"/>
               </w:rPr>
-              <w:t xml:space="preserve">g_h</w:t>
+              <w:t xml:space="preserve">c_white</w:t>
+            </w:r>
+            <w:r>
+              <w:rPr>
+                <w:sz w:val="19"/>
+                <w:szCs w:val="19"/>
+              </w:rPr>
+              <w:t xml:space="preserve">, </w:t>
+            </w:r>
+            <w:r>
+              <w:rPr>
+                <w:rFonts w:ascii="Consolas" w:cs="Consolas" w:eastAsia="Consolas" w:hAnsi="Consolas"/>
+                <w:sz w:val="19"/>
+                <w:szCs w:val="19"/>
+              </w:rPr>
+              <w:t xml:space="preserve">c_black</w:t>
+            </w:r>
+            <w:r>
+              <w:rPr>
+                <w:sz w:val="19"/>
+                <w:szCs w:val="19"/>
+              </w:rPr>
+              <w:t xml:space="preserve">, </w:t>
+            </w:r>
+            <w:r>
+              <w:rPr>
+                <w:rFonts w:ascii="Consolas" w:cs="Consolas" w:eastAsia="Consolas" w:hAnsi="Consolas"/>
+                <w:sz w:val="19"/>
+                <w:szCs w:val="19"/>
+              </w:rPr>
+              <w:t xml:space="preserve">c_yellow</w:t>
             </w:r>
           </w:p>
         </w:tc>
@@ -4899,7 +4746,7 @@
                 <w:sz w:val="19"/>
                 <w:szCs w:val="19"/>
               </w:rPr>
-              <w:t xml:space="preserve">31</w:t>
+              <w:t xml:space="preserve">see Section 2</w:t>
             </w:r>
           </w:p>
         </w:tc>
@@ -4930,7 +4777,7 @@
                 <w:sz w:val="19"/>
                 <w:szCs w:val="19"/>
               </w:rPr>
-              <w:t xml:space="preserve">Gnomon height; sets the slope for your latitude.</w:t>
+              <w:t xml:space="preserve">Preview colors. Change them to try other palettes.</w:t>
             </w:r>
           </w:p>
         </w:tc>
@@ -4966,6 +4813,103 @@
                 <w:sz w:val="19"/>
                 <w:szCs w:val="19"/>
               </w:rPr>
+              <w:t xml:space="preserve">g_h</w:t>
+            </w:r>
+          </w:p>
+        </w:tc>
+        <w:tc>
+          <w:tcPr>
+            <w:tcW w:type="dxa" w:w="1500"/>
+            <w:tcBorders>
+              <w:top w:val="single" w:color="C9C4B5" w:sz="4"/>
+              <w:left w:val="single" w:color="C9C4B5" w:sz="4"/>
+              <w:bottom w:val="single" w:color="C9C4B5" w:sz="4"/>
+              <w:right w:val="single" w:color="C9C4B5" w:sz="4"/>
+            </w:tcBorders>
+            <w:tcMar>
+              <w:top w:type="dxa" w:w="40"/>
+              <w:left w:type="dxa" w:w="100"/>
+              <w:bottom w:type="dxa" w:w="40"/>
+              <w:right w:type="dxa" w:w="100"/>
+            </w:tcMar>
+          </w:tcPr>
+          <w:p>
+            <w:pPr>
+              <w:spacing w:after="40" w:before="40"/>
+              <w:jc w:val="left"/>
+            </w:pPr>
+            <w:r>
+              <w:rPr>
+                <w:sz w:val="19"/>
+                <w:szCs w:val="19"/>
+              </w:rPr>
+              <w:t xml:space="preserve">31</w:t>
+            </w:r>
+          </w:p>
+        </w:tc>
+        <w:tc>
+          <w:tcPr>
+            <w:tcW w:type="dxa" w:w="5526"/>
+            <w:tcBorders>
+              <w:top w:val="single" w:color="C9C4B5" w:sz="4"/>
+              <w:left w:val="single" w:color="C9C4B5" w:sz="4"/>
+              <w:bottom w:val="single" w:color="C9C4B5" w:sz="4"/>
+              <w:right w:val="single" w:color="C9C4B5" w:sz="4"/>
+            </w:tcBorders>
+            <w:tcMar>
+              <w:top w:type="dxa" w:w="40"/>
+              <w:left w:type="dxa" w:w="100"/>
+              <w:bottom w:type="dxa" w:w="40"/>
+              <w:right w:type="dxa" w:w="100"/>
+            </w:tcMar>
+          </w:tcPr>
+          <w:p>
+            <w:pPr>
+              <w:spacing w:after="40" w:before="40"/>
+              <w:jc w:val="left"/>
+            </w:pPr>
+            <w:r>
+              <w:rPr>
+                <w:sz w:val="19"/>
+                <w:szCs w:val="19"/>
+              </w:rPr>
+              <w:t xml:space="preserve">Gnomon height; sets the slope for your latitude.</w:t>
+            </w:r>
+          </w:p>
+        </w:tc>
+      </w:tr>
+      <w:tr>
+        <w:trPr>
+          <w:cantSplit/>
+        </w:trPr>
+        <w:tc>
+          <w:tcPr>
+            <w:tcW w:type="dxa" w:w="2000"/>
+            <w:tcBorders>
+              <w:top w:val="single" w:color="C9C4B5" w:sz="4"/>
+              <w:left w:val="single" w:color="C9C4B5" w:sz="4"/>
+              <w:bottom w:val="single" w:color="C9C4B5" w:sz="4"/>
+              <w:right w:val="single" w:color="C9C4B5" w:sz="4"/>
+            </w:tcBorders>
+            <w:shd w:fill="FAF8F2" w:color="auto" w:val="clear"/>
+            <w:tcMar>
+              <w:top w:type="dxa" w:w="40"/>
+              <w:left w:type="dxa" w:w="100"/>
+              <w:bottom w:type="dxa" w:w="40"/>
+              <w:right w:type="dxa" w:w="100"/>
+            </w:tcMar>
+          </w:tcPr>
+          <w:p>
+            <w:pPr>
+              <w:spacing w:after="40" w:before="40"/>
+              <w:jc w:val="left"/>
+            </w:pPr>
+            <w:r>
+              <w:rPr>
+                <w:rFonts w:ascii="Consolas" w:cs="Consolas" w:eastAsia="Consolas" w:hAnsi="Consolas"/>
+                <w:sz w:val="19"/>
+                <w:szCs w:val="19"/>
+              </w:rPr>
               <w:t xml:space="preserve">$fn</w:t>
             </w:r>
           </w:p>
@@ -4979,6 +4923,7 @@
               <w:bottom w:val="single" w:color="C9C4B5" w:sz="4"/>
               <w:right w:val="single" w:color="C9C4B5" w:sz="4"/>
             </w:tcBorders>
+            <w:shd w:fill="FAF8F2" w:color="auto" w:val="clear"/>
             <w:tcMar>
               <w:top w:type="dxa" w:w="40"/>
               <w:left w:type="dxa" w:w="100"/>
@@ -5009,6 +4954,7 @@
               <w:bottom w:val="single" w:color="C9C4B5" w:sz="4"/>
               <w:right w:val="single" w:color="C9C4B5" w:sz="4"/>
             </w:tcBorders>
+            <w:shd w:fill="FAF8F2" w:color="auto" w:val="clear"/>
             <w:tcMar>
               <w:top w:type="dxa" w:w="40"/>
               <w:left w:type="dxa" w:w="100"/>
@@ -5061,7 +5007,7 @@
           <w:sz w:val="21"/>
           <w:szCs w:val="21"/>
         </w:rPr>
-        <w:t xml:space="preserve">Four-color palette with one-setting export per color.</w:t>
+        <w:t xml:space="preserve">Three-color palette (white, black, yellow) with one-setting export per color.</w:t>
       </w:r>
     </w:p>
     <w:p>
@@ -5078,7 +5024,7 @@
           <w:sz w:val="21"/>
           <w:szCs w:val="21"/>
         </w:rPr>
-        <w:t xml:space="preserve">Degree ticks are now inlaid in navy. The ticks under the N, E, S, W letters and the hang hole were removed so nothing overlaps.</w:t>
+        <w:t xml:space="preserve">Degree ticks are now inlaid in black. The ticks under the N, E, S, W letters, at the hang hole and beside the N badge were removed so nothing overlaps.</w:t>
       </w:r>
     </w:p>
     <w:p>
@@ -5112,7 +5058,7 @@
           <w:sz w:val="21"/>
           <w:szCs w:val="21"/>
         </w:rPr>
-        <w:t xml:space="preserve">New gold edge ring and star halos on the disc; the pointer is gold.</w:t>
+        <w:t xml:space="preserve">New yellow edge ring and star halos on the disc; the pointer is yellow. The N letter is yellow on a black badge.</w:t>
       </w:r>
     </w:p>
     <w:p>
@@ -5137,7 +5083,7 @@
         <w:pStyle w:val="Heading1"/>
         <w:keepNext/>
         <w:pBdr>
-          <w:bottom w:val="single" w:color="F2B531" w:sz="8" w:space="3"/>
+          <w:bottom w:val="single" w:color="FFD21F" w:sz="8" w:space="3"/>
         </w:pBdr>
         <w:spacing w:after="140" w:before="320"/>
       </w:pPr>
@@ -5175,7 +5121,7 @@
               <w:bottom w:val="single" w:color="C9C4B5" w:sz="4"/>
               <w:right w:val="single" w:color="C9C4B5" w:sz="4"/>
             </w:tcBorders>
-            <w:shd w:fill="12224A" w:color="auto" w:val="clear"/>
+            <w:shd w:fill="17181C" w:color="auto" w:val="clear"/>
             <w:tcMar>
               <w:top w:type="dxa" w:w="40"/>
               <w:left w:type="dxa" w:w="100"/>
@@ -5209,7 +5155,7 @@
               <w:bottom w:val="single" w:color="C9C4B5" w:sz="4"/>
               <w:right w:val="single" w:color="C9C4B5" w:sz="4"/>
             </w:tcBorders>
-            <w:shd w:fill="12224A" w:color="auto" w:val="clear"/>
+            <w:shd w:fill="17181C" w:color="auto" w:val="clear"/>
             <w:tcMar>
               <w:top w:type="dxa" w:w="40"/>
               <w:left w:type="dxa" w:w="100"/>
@@ -5295,7 +5241,7 @@
                 <w:sz w:val="19"/>
                 <w:szCs w:val="19"/>
               </w:rPr>
-              <w:t xml:space="preserve">Import all four STLs together and choose “single object with multiple parts”. Do not auto-orient or re-center the files one by one.</w:t>
+              <w:t xml:space="preserve">Import all three STLs together and choose “single object with multiple parts”. Do not auto-orient or re-center the files one by one.</w:t>
             </w:r>
           </w:p>
         </w:tc>
@@ -5683,7 +5629,7 @@
   <w:p>
     <w:pPr>
       <w:pBdr>
-        <w:top w:val="single" w:color="F2B531" w:sz="4" w:space="6"/>
+        <w:top w:val="single" w:color="FFD21F" w:sz="4" w:space="6"/>
       </w:pBdr>
       <w:tabs>
         <w:tab w:val="right" w:pos="9026"/>
@@ -5893,7 +5839,7 @@
       <w:rPr>
         <w:b/>
         <w:bCs/>
-        <w:color w:val="F2B531"/>
+        <w:color w:val="FFD21F"/>
       </w:rPr>
     </w:lvl>
   </w:abstractNum>
@@ -5910,7 +5856,7 @@
       <w:rPr>
         <w:b/>
         <w:bCs/>
-        <w:color w:val="12224A"/>
+        <w:color w:val="17181C"/>
       </w:rPr>
     </w:lvl>
   </w:abstractNum>
@@ -5927,7 +5873,7 @@
       <w:rPr>
         <w:b/>
         <w:bCs/>
-        <w:color w:val="12224A"/>
+        <w:color w:val="17181C"/>
       </w:rPr>
     </w:lvl>
   </w:abstractNum>
@@ -5944,7 +5890,7 @@
       <w:rPr>
         <w:b/>
         <w:bCs/>
-        <w:color w:val="12224A"/>
+        <w:color w:val="17181C"/>
       </w:rPr>
     </w:lvl>
   </w:abstractNum>
@@ -6176,7 +6122,7 @@
       <w:rFonts w:ascii="Arial" w:cs="Arial" w:eastAsia="Arial" w:hAnsi="Arial"/>
       <w:b/>
       <w:bCs/>
-      <w:color w:val="12224A"/>
+      <w:color w:val="17181C"/>
       <w:sz w:val="32"/>
       <w:szCs w:val="32"/>
     </w:rPr>
@@ -6193,7 +6139,7 @@
       <w:rFonts w:ascii="Arial" w:cs="Arial" w:eastAsia="Arial" w:hAnsi="Arial"/>
       <w:b/>
       <w:bCs/>
-      <w:color w:val="EE5B3B"/>
+      <w:color w:val="9A6B00"/>
       <w:sz w:val="24"/>
       <w:szCs w:val="24"/>
     </w:rPr>

</xml_diff>

<commit_message>
Enlarge star holes to 2.6mm and move star line clear of the pivot hole
Small 1.5mm holes closed up when printed. Hole diameter is now the star_d
parameter (2.6mm) with halo derived from it; the seven-star line moved 4mm
up so no hole or halo ring overlaps the center pin hole. Guides updated.

Co-Authored-By: Claude Sonnet 5.5 <noreply@anthropic.com>
Claude-Session: https://claude.ai/code/session_014TaHyWtXwxC7vjRjrVQQih
</commit_message>
<xml_diff>
--- a/3d-print/Planisphere_Gnomon_Color_Guide.docx
+++ b/3d-print/Planisphere_Gnomon_Color_Guide.docx
@@ -3887,7 +3887,7 @@
           <w:sz w:val="21"/>
           <w:szCs w:val="21"/>
         </w:rPr>
-        <w:t xml:space="preserve"> Hold the disc up to a lamp or the sky. The two star groups (a 7-star line and a 5-star cluster) shine through the 1.5 mm holes.</w:t>
+        <w:t xml:space="preserve"> Hold the disc up to a lamp or the sky. The two star groups (a 7-star line and a 5-star cluster) shine through the 2.6 mm holes.</w:t>
       </w:r>
     </w:p>
     <w:p>
@@ -4490,7 +4490,7 @@
                 <w:sz w:val="19"/>
                 <w:szCs w:val="19"/>
               </w:rPr>
-              <w:t xml:space="preserve">north_badge</w:t>
+              <w:t xml:space="preserve">star_d</w:t>
             </w:r>
           </w:p>
         </w:tc>
@@ -4521,7 +4521,7 @@
                 <w:sz w:val="19"/>
                 <w:szCs w:val="19"/>
               </w:rPr>
-              <w:t xml:space="preserve">true</w:t>
+              <w:t xml:space="preserve">2.6</w:t>
             </w:r>
           </w:p>
         </w:tc>
@@ -4552,7 +4552,7 @@
                 <w:sz w:val="19"/>
                 <w:szCs w:val="19"/>
               </w:rPr>
-              <w:t xml:space="preserve">Black round badge behind the yellow N so it stays readable on the white base.</w:t>
+              <w:t xml:space="preserve">Star hole diameter in mm. Small holes print undersized and can close up, so stay at 2.4 mm or more.</w:t>
             </w:r>
           </w:p>
         </w:tc>
@@ -4588,7 +4588,7 @@
                 <w:sz w:val="19"/>
                 <w:szCs w:val="19"/>
               </w:rPr>
-              <w:t xml:space="preserve">show_bed</w:t>
+              <w:t xml:space="preserve">north_badge</w:t>
             </w:r>
           </w:p>
         </w:tc>
@@ -4648,7 +4648,7 @@
                 <w:sz w:val="19"/>
                 <w:szCs w:val="19"/>
               </w:rPr>
-              <w:t xml:space="preserve">Draws the 250 × 250 mm bed outline in the preview only. It is never exported.</w:t>
+              <w:t xml:space="preserve">Black round badge behind the yellow N so it stays readable on the white base.</w:t>
             </w:r>
           </w:p>
         </w:tc>
@@ -4685,37 +4685,7 @@
                 <w:sz w:val="19"/>
                 <w:szCs w:val="19"/>
               </w:rPr>
-              <w:t xml:space="preserve">c_white</w:t>
-            </w:r>
-            <w:r>
-              <w:rPr>
-                <w:sz w:val="19"/>
-                <w:szCs w:val="19"/>
-              </w:rPr>
-              <w:t xml:space="preserve">, </w:t>
-            </w:r>
-            <w:r>
-              <w:rPr>
-                <w:rFonts w:ascii="Consolas" w:cs="Consolas" w:eastAsia="Consolas" w:hAnsi="Consolas"/>
-                <w:sz w:val="19"/>
-                <w:szCs w:val="19"/>
-              </w:rPr>
-              <w:t xml:space="preserve">c_black</w:t>
-            </w:r>
-            <w:r>
-              <w:rPr>
-                <w:sz w:val="19"/>
-                <w:szCs w:val="19"/>
-              </w:rPr>
-              <w:t xml:space="preserve">, </w:t>
-            </w:r>
-            <w:r>
-              <w:rPr>
-                <w:rFonts w:ascii="Consolas" w:cs="Consolas" w:eastAsia="Consolas" w:hAnsi="Consolas"/>
-                <w:sz w:val="19"/>
-                <w:szCs w:val="19"/>
-              </w:rPr>
-              <w:t xml:space="preserve">c_yellow</w:t>
+              <w:t xml:space="preserve">show_bed</w:t>
             </w:r>
           </w:p>
         </w:tc>
@@ -4746,7 +4716,7 @@
                 <w:sz w:val="19"/>
                 <w:szCs w:val="19"/>
               </w:rPr>
-              <w:t xml:space="preserve">see Section 2</w:t>
+              <w:t xml:space="preserve">true</w:t>
             </w:r>
           </w:p>
         </w:tc>
@@ -4777,7 +4747,7 @@
                 <w:sz w:val="19"/>
                 <w:szCs w:val="19"/>
               </w:rPr>
-              <w:t xml:space="preserve">Preview colors. Change them to try other palettes.</w:t>
+              <w:t xml:space="preserve">Draws the 250 × 250 mm bed outline in the preview only. It is never exported.</w:t>
             </w:r>
           </w:p>
         </w:tc>
@@ -4813,7 +4783,37 @@
                 <w:sz w:val="19"/>
                 <w:szCs w:val="19"/>
               </w:rPr>
-              <w:t xml:space="preserve">g_h</w:t>
+              <w:t xml:space="preserve">c_white</w:t>
+            </w:r>
+            <w:r>
+              <w:rPr>
+                <w:sz w:val="19"/>
+                <w:szCs w:val="19"/>
+              </w:rPr>
+              <w:t xml:space="preserve">, </w:t>
+            </w:r>
+            <w:r>
+              <w:rPr>
+                <w:rFonts w:ascii="Consolas" w:cs="Consolas" w:eastAsia="Consolas" w:hAnsi="Consolas"/>
+                <w:sz w:val="19"/>
+                <w:szCs w:val="19"/>
+              </w:rPr>
+              <w:t xml:space="preserve">c_black</w:t>
+            </w:r>
+            <w:r>
+              <w:rPr>
+                <w:sz w:val="19"/>
+                <w:szCs w:val="19"/>
+              </w:rPr>
+              <w:t xml:space="preserve">, </w:t>
+            </w:r>
+            <w:r>
+              <w:rPr>
+                <w:rFonts w:ascii="Consolas" w:cs="Consolas" w:eastAsia="Consolas" w:hAnsi="Consolas"/>
+                <w:sz w:val="19"/>
+                <w:szCs w:val="19"/>
+              </w:rPr>
+              <w:t xml:space="preserve">c_yellow</w:t>
             </w:r>
           </w:p>
         </w:tc>
@@ -4843,7 +4843,7 @@
                 <w:sz w:val="19"/>
                 <w:szCs w:val="19"/>
               </w:rPr>
-              <w:t xml:space="preserve">31</w:t>
+              <w:t xml:space="preserve">see Section 2</w:t>
             </w:r>
           </w:p>
         </w:tc>
@@ -4873,7 +4873,7 @@
                 <w:sz w:val="19"/>
                 <w:szCs w:val="19"/>
               </w:rPr>
-              <w:t xml:space="preserve">Gnomon height; sets the slope for your latitude.</w:t>
+              <w:t xml:space="preserve">Preview colors. Change them to try other palettes.</w:t>
             </w:r>
           </w:p>
         </w:tc>
@@ -4910,6 +4910,104 @@
                 <w:sz w:val="19"/>
                 <w:szCs w:val="19"/>
               </w:rPr>
+              <w:t xml:space="preserve">g_h</w:t>
+            </w:r>
+          </w:p>
+        </w:tc>
+        <w:tc>
+          <w:tcPr>
+            <w:tcW w:type="dxa" w:w="1500"/>
+            <w:tcBorders>
+              <w:top w:val="single" w:color="C9C4B5" w:sz="4"/>
+              <w:left w:val="single" w:color="C9C4B5" w:sz="4"/>
+              <w:bottom w:val="single" w:color="C9C4B5" w:sz="4"/>
+              <w:right w:val="single" w:color="C9C4B5" w:sz="4"/>
+            </w:tcBorders>
+            <w:shd w:fill="FAF8F2" w:color="auto" w:val="clear"/>
+            <w:tcMar>
+              <w:top w:type="dxa" w:w="40"/>
+              <w:left w:type="dxa" w:w="100"/>
+              <w:bottom w:type="dxa" w:w="40"/>
+              <w:right w:type="dxa" w:w="100"/>
+            </w:tcMar>
+          </w:tcPr>
+          <w:p>
+            <w:pPr>
+              <w:spacing w:after="40" w:before="40"/>
+              <w:jc w:val="left"/>
+            </w:pPr>
+            <w:r>
+              <w:rPr>
+                <w:sz w:val="19"/>
+                <w:szCs w:val="19"/>
+              </w:rPr>
+              <w:t xml:space="preserve">31</w:t>
+            </w:r>
+          </w:p>
+        </w:tc>
+        <w:tc>
+          <w:tcPr>
+            <w:tcW w:type="dxa" w:w="5526"/>
+            <w:tcBorders>
+              <w:top w:val="single" w:color="C9C4B5" w:sz="4"/>
+              <w:left w:val="single" w:color="C9C4B5" w:sz="4"/>
+              <w:bottom w:val="single" w:color="C9C4B5" w:sz="4"/>
+              <w:right w:val="single" w:color="C9C4B5" w:sz="4"/>
+            </w:tcBorders>
+            <w:shd w:fill="FAF8F2" w:color="auto" w:val="clear"/>
+            <w:tcMar>
+              <w:top w:type="dxa" w:w="40"/>
+              <w:left w:type="dxa" w:w="100"/>
+              <w:bottom w:type="dxa" w:w="40"/>
+              <w:right w:type="dxa" w:w="100"/>
+            </w:tcMar>
+          </w:tcPr>
+          <w:p>
+            <w:pPr>
+              <w:spacing w:after="40" w:before="40"/>
+              <w:jc w:val="left"/>
+            </w:pPr>
+            <w:r>
+              <w:rPr>
+                <w:sz w:val="19"/>
+                <w:szCs w:val="19"/>
+              </w:rPr>
+              <w:t xml:space="preserve">Gnomon height; sets the slope for your latitude.</w:t>
+            </w:r>
+          </w:p>
+        </w:tc>
+      </w:tr>
+      <w:tr>
+        <w:trPr>
+          <w:cantSplit/>
+        </w:trPr>
+        <w:tc>
+          <w:tcPr>
+            <w:tcW w:type="dxa" w:w="2000"/>
+            <w:tcBorders>
+              <w:top w:val="single" w:color="C9C4B5" w:sz="4"/>
+              <w:left w:val="single" w:color="C9C4B5" w:sz="4"/>
+              <w:bottom w:val="single" w:color="C9C4B5" w:sz="4"/>
+              <w:right w:val="single" w:color="C9C4B5" w:sz="4"/>
+            </w:tcBorders>
+            <w:tcMar>
+              <w:top w:type="dxa" w:w="40"/>
+              <w:left w:type="dxa" w:w="100"/>
+              <w:bottom w:type="dxa" w:w="40"/>
+              <w:right w:type="dxa" w:w="100"/>
+            </w:tcMar>
+          </w:tcPr>
+          <w:p>
+            <w:pPr>
+              <w:spacing w:after="40" w:before="40"/>
+              <w:jc w:val="left"/>
+            </w:pPr>
+            <w:r>
+              <w:rPr>
+                <w:rFonts w:ascii="Consolas" w:cs="Consolas" w:eastAsia="Consolas" w:hAnsi="Consolas"/>
+                <w:sz w:val="19"/>
+                <w:szCs w:val="19"/>
+              </w:rPr>
               <w:t xml:space="preserve">$fn</w:t>
             </w:r>
           </w:p>
@@ -4923,7 +5021,6 @@
               <w:bottom w:val="single" w:color="C9C4B5" w:sz="4"/>
               <w:right w:val="single" w:color="C9C4B5" w:sz="4"/>
             </w:tcBorders>
-            <w:shd w:fill="FAF8F2" w:color="auto" w:val="clear"/>
             <w:tcMar>
               <w:top w:type="dxa" w:w="40"/>
               <w:left w:type="dxa" w:w="100"/>
@@ -4954,7 +5051,6 @@
               <w:bottom w:val="single" w:color="C9C4B5" w:sz="4"/>
               <w:right w:val="single" w:color="C9C4B5" w:sz="4"/>
             </w:tcBorders>
-            <w:shd w:fill="FAF8F2" w:color="auto" w:val="clear"/>
             <w:tcMar>
               <w:top w:type="dxa" w:w="40"/>
               <w:left w:type="dxa" w:w="100"/>
@@ -5059,6 +5155,23 @@
           <w:szCs w:val="21"/>
         </w:rPr>
         <w:t xml:space="preserve">New yellow edge ring and star halos on the disc; the pointer is yellow. The N letter is yellow on a black badge.</w:t>
+      </w:r>
+    </w:p>
+    <w:p>
+      <w:pPr>
+        <w:pStyle w:val="ListParagraph"/>
+        <w:numPr>
+          <w:ilvl w:val="0"/>
+          <w:numId w:val="4"/>
+        </w:numPr>
+        <w:spacing w:after="60" w:line="276"/>
+      </w:pPr>
+      <w:r>
+        <w:rPr>
+          <w:sz w:val="21"/>
+          <w:szCs w:val="21"/>
+        </w:rPr>
+        <w:t xml:space="preserve">Star holes enlarged from Ø1.5 to Ø2.6 mm so they stay open when printed. The seven-star line moved 4 mm up so no hole or ring touches the center pin hole.</w:t>
       </w:r>
     </w:p>
     <w:p>
@@ -5520,6 +5633,87 @@
                 <w:sz w:val="19"/>
                 <w:szCs w:val="19"/>
               </w:rPr>
+              <w:t xml:space="preserve">Star holes are closed or barely visible</w:t>
+            </w:r>
+          </w:p>
+        </w:tc>
+        <w:tc>
+          <w:tcPr>
+            <w:tcW w:type="dxa" w:w="6026"/>
+            <w:tcBorders>
+              <w:top w:val="single" w:color="C9C4B5" w:sz="4"/>
+              <w:left w:val="single" w:color="C9C4B5" w:sz="4"/>
+              <w:bottom w:val="single" w:color="C9C4B5" w:sz="4"/>
+              <w:right w:val="single" w:color="C9C4B5" w:sz="4"/>
+            </w:tcBorders>
+            <w:tcMar>
+              <w:top w:type="dxa" w:w="40"/>
+              <w:left w:type="dxa" w:w="100"/>
+              <w:bottom w:type="dxa" w:w="40"/>
+              <w:right w:type="dxa" w:w="100"/>
+            </w:tcMar>
+          </w:tcPr>
+          <w:p>
+            <w:pPr>
+              <w:spacing w:after="40" w:before="40"/>
+              <w:jc w:val="left"/>
+            </w:pPr>
+            <w:r>
+              <w:rPr>
+                <w:sz w:val="19"/>
+                <w:szCs w:val="19"/>
+              </w:rPr>
+              <w:t xml:space="preserve">Increase </w:t>
+            </w:r>
+            <w:r>
+              <w:rPr>
+                <w:rFonts w:ascii="Consolas" w:cs="Consolas" w:eastAsia="Consolas" w:hAnsi="Consolas"/>
+                <w:sz w:val="19"/>
+                <w:szCs w:val="19"/>
+              </w:rPr>
+              <w:t xml:space="preserve">star_d</w:t>
+            </w:r>
+            <w:r>
+              <w:rPr>
+                <w:sz w:val="19"/>
+                <w:szCs w:val="19"/>
+              </w:rPr>
+              <w:t xml:space="preserve"> (default 2.6 mm; try 3 mm if still tight). You can also use your slicer’s X-Y hole compensation (about +0.1 mm).</w:t>
+            </w:r>
+          </w:p>
+        </w:tc>
+      </w:tr>
+      <w:tr>
+        <w:trPr>
+          <w:cantSplit/>
+        </w:trPr>
+        <w:tc>
+          <w:tcPr>
+            <w:tcW w:type="dxa" w:w="3000"/>
+            <w:tcBorders>
+              <w:top w:val="single" w:color="C9C4B5" w:sz="4"/>
+              <w:left w:val="single" w:color="C9C4B5" w:sz="4"/>
+              <w:bottom w:val="single" w:color="C9C4B5" w:sz="4"/>
+              <w:right w:val="single" w:color="C9C4B5" w:sz="4"/>
+            </w:tcBorders>
+            <w:shd w:fill="FAF8F2" w:color="auto" w:val="clear"/>
+            <w:tcMar>
+              <w:top w:type="dxa" w:w="40"/>
+              <w:left w:type="dxa" w:w="100"/>
+              <w:bottom w:type="dxa" w:w="40"/>
+              <w:right w:type="dxa" w:w="100"/>
+            </w:tcMar>
+          </w:tcPr>
+          <w:p>
+            <w:pPr>
+              <w:spacing w:after="40" w:before="40"/>
+              <w:jc w:val="left"/>
+            </w:pPr>
+            <w:r>
+              <w:rPr>
+                <w:sz w:val="19"/>
+                <w:szCs w:val="19"/>
+              </w:rPr>
               <w:t xml:space="preserve">Rendering is slow</w:t>
             </w:r>
           </w:p>
@@ -5533,6 +5727,7 @@
               <w:bottom w:val="single" w:color="C9C4B5" w:sz="4"/>
               <w:right w:val="single" w:color="C9C4B5" w:sz="4"/>
             </w:tcBorders>
+            <w:shd w:fill="FAF8F2" w:color="auto" w:val="clear"/>
             <w:tcMar>
               <w:top w:type="dxa" w:w="40"/>
               <w:left w:type="dxa" w:w="100"/>

</xml_diff>